<commit_message>
eliminates the depreciated GetAdditionalLocationPricing Adds UserId to grid
</commit_message>
<xml_diff>
--- a/CUWebinars.Web/App_Data/mergeTemplates/OrderSubmitted_PreEvent.docx
+++ b/CUWebinars.Web/App_Data/mergeTemplates/OrderSubmitted_PreEvent.docx
@@ -450,291 +450,308 @@
             <w:r>
               <w:t xml:space="preserve">Dear </w:t>
             </w:r>
-            <w:fldSimple w:instr=" MERGEFIELD  FirstName  \* MERGEFORMAT ">
+            <w:r>
+              <w:fldChar w:fldCharType="begin"/>
+            </w:r>
+            <w:r>
+              <w:instrText xml:space="preserve"> MERGEFIELD  FirstName  \* MERGEFORMAT </w:instrText>
+            </w:r>
+            <w:r>
+              <w:fldChar w:fldCharType="separate"/>
+            </w:r>
+            <w:r>
+              <w:rPr>
+                <w:noProof/>
+              </w:rPr>
+              <w:t>«FirstName»</w:t>
+            </w:r>
+            <w:r>
+              <w:rPr>
+                <w:noProof/>
+              </w:rPr>
+              <w:fldChar w:fldCharType="end"/>
+            </w:r>
+            <w:r>
+              <w:t>,</w:t>
+            </w:r>
+          </w:p>
+          <w:p/>
+          <w:p>
+            <w:r>
+              <w:t>Thank</w:t>
+            </w:r>
+            <w:r>
+              <w:t xml:space="preserve"> you</w:t>
+            </w:r>
+            <w:r>
+              <w:t xml:space="preserve"> for your</w:t>
+            </w:r>
+            <w:r>
+              <w:t xml:space="preserve"> </w:t>
+            </w:r>
+            <w:r>
+              <w:t xml:space="preserve">order </w:t>
+            </w:r>
+            <w:r>
+              <w:t>for</w:t>
+            </w:r>
+            <w:r>
+              <w:t xml:space="preserve"> the</w:t>
+            </w:r>
+            <w:r>
+              <w:t xml:space="preserve"> </w:t>
+            </w:r>
+            <w:bookmarkStart w:id="1" w:name="OLE_LINK1"/>
+            <w:bookmarkStart w:id="2" w:name="OLE_LINK2"/>
+            <w:bookmarkStart w:id="3" w:name="OLE_LINK3"/>
+            <w:r>
+              <w:rPr>
+                <w:i/>
+              </w:rPr>
+              <w:fldChar w:fldCharType="begin"/>
+            </w:r>
+            <w:r>
+              <w:rPr>
+                <w:i/>
+              </w:rPr>
+              <w:instrText xml:space="preserve"> MERGEFIELD  WebinarTitle  \* MERGEFORMAT </w:instrText>
+            </w:r>
+            <w:r>
+              <w:rPr>
+                <w:i/>
+              </w:rPr>
+              <w:fldChar w:fldCharType="separate"/>
+            </w:r>
+            <w:r>
+              <w:rPr>
+                <w:i/>
+                <w:noProof/>
+              </w:rPr>
+              <w:t>«WebinarTitle»</w:t>
+            </w:r>
+            <w:r>
+              <w:rPr>
+                <w:i/>
+              </w:rPr>
+              <w:fldChar w:fldCharType="end"/>
+            </w:r>
+            <w:bookmarkEnd w:id="1"/>
+            <w:bookmarkEnd w:id="2"/>
+            <w:bookmarkEnd w:id="3"/>
+            <w:r>
+              <w:rPr>
+                <w:i/>
+              </w:rPr>
+              <w:t xml:space="preserve"> </w:t>
+            </w:r>
+            <w:r>
+              <w:t>webinar</w:t>
+            </w:r>
+            <w:r>
+              <w:t>!</w:t>
+            </w:r>
+            <w:r>
+              <w:t xml:space="preserve"> </w:t>
+            </w:r>
+            <w:r>
+              <w:fldChar w:fldCharType="begin"/>
+            </w:r>
+            <w:r>
+              <w:instrText xml:space="preserve"> MERGEFIELD  RegDesc  \* MERGEFORMAT </w:instrText>
+            </w:r>
+            <w:r>
+              <w:fldChar w:fldCharType="separate"/>
+            </w:r>
+            <w:r>
+              <w:rPr>
+                <w:noProof/>
+              </w:rPr>
+              <w:t>«RegDesc»</w:t>
+            </w:r>
+            <w:r>
+              <w:rPr>
+                <w:noProof/>
+              </w:rPr>
+              <w:fldChar w:fldCharType="end"/>
+            </w:r>
+            <w:r>
+              <w:t xml:space="preserve"> </w:t>
+            </w:r>
+          </w:p>
+          <w:p/>
+          <w:p>
+            <w:r>
+              <w:t xml:space="preserve">Everything you need to know about </w:t>
+            </w:r>
+            <w:r>
+              <w:rPr>
+                <w:i/>
+              </w:rPr>
+              <w:t>‘next steps’</w:t>
+            </w:r>
+            <w:r>
+              <w:t xml:space="preserve"> can be found </w:t>
+            </w:r>
+            <w:r>
+              <w:t>below</w:t>
+            </w:r>
+            <w:r>
+              <w:t>:</w:t>
+            </w:r>
+          </w:p>
+          <w:p>
+            <w:pPr>
+              <w:ind w:left="532" w:hanging="532"/>
+              <w:rPr>
+                <w:noProof/>
+              </w:rPr>
+            </w:pPr>
+            <w:r>
+              <w:rPr>
+                <w:b/>
+                <w:i/>
+              </w:rPr>
+              <w:t xml:space="preserve">If you </w:t>
+            </w:r>
+            <w:r>
+              <w:rPr>
+                <w:b/>
+                <w:i/>
+              </w:rPr>
+              <w:t>will be</w:t>
+            </w:r>
+            <w:r>
+              <w:rPr>
+                <w:b/>
+                <w:i/>
+              </w:rPr>
+              <w:t xml:space="preserve"> </w:t>
+            </w:r>
+            <w:r>
+              <w:rPr>
+                <w:b/>
+                <w:i/>
+              </w:rPr>
+              <w:t>attending alone or</w:t>
+            </w:r>
+            <w:r>
+              <w:rPr>
+                <w:b/>
+                <w:i/>
+              </w:rPr>
+              <w:t xml:space="preserve"> with</w:t>
+            </w:r>
+            <w:r>
+              <w:rPr>
+                <w:b/>
+                <w:i/>
+              </w:rPr>
+              <w:t xml:space="preserve"> co-workers</w:t>
+            </w:r>
+            <w:r>
+              <w:rPr>
+                <w:b/>
+                <w:i/>
+              </w:rPr>
+              <w:t xml:space="preserve"> at one location</w:t>
+            </w:r>
+            <w:r>
+              <w:t xml:space="preserve"> – </w:t>
+            </w:r>
+            <w:r>
+              <w:t>everything you need can be found at this link:</w:t>
+            </w:r>
+            <w:r>
+              <w:t xml:space="preserve"> </w:t>
+            </w:r>
+            <w:r>
+              <w:t xml:space="preserve"> </w:t>
+            </w:r>
+            <w:fldSimple w:instr=" MERGEFIELD  ClickToJoinLink  \* MERGEFORMAT ">
               <w:r>
                 <w:rPr>
                   <w:noProof/>
                 </w:rPr>
-                <w:t>«FirstName»</w:t>
+                <w:t>«ClickToJoinLink»</w:t>
               </w:r>
             </w:fldSimple>
             <w:r>
-              <w:t>,</w:t>
+              <w:rPr>
+                <w:noProof/>
+              </w:rPr>
+              <w:t xml:space="preserve"> </w:t>
             </w:r>
           </w:p>
           <w:p/>
           <w:p>
-            <w:r>
-              <w:t>Thank</w:t>
-            </w:r>
-            <w:r>
-              <w:t xml:space="preserve"> you</w:t>
-            </w:r>
-            <w:r>
-              <w:t xml:space="preserve"> for your</w:t>
+            <w:pPr>
+              <w:ind w:left="532" w:hanging="540"/>
+            </w:pPr>
+            <w:r>
+              <w:rPr>
+                <w:b/>
+                <w:i/>
+              </w:rPr>
+              <w:t>If you need to help an associate make the connection to the event</w:t>
             </w:r>
             <w:r>
               <w:t xml:space="preserve"> </w:t>
             </w:r>
             <w:r>
-              <w:t xml:space="preserve">order </w:t>
-            </w:r>
-            <w:r>
-              <w:t>for</w:t>
-            </w:r>
-            <w:r>
-              <w:t xml:space="preserve"> the</w:t>
-            </w:r>
-            <w:r>
-              <w:t xml:space="preserve"> </w:t>
-            </w:r>
-            <w:bookmarkStart w:id="1" w:name="OLE_LINK1"/>
-            <w:bookmarkStart w:id="2" w:name="OLE_LINK2"/>
-            <w:bookmarkStart w:id="3" w:name="OLE_LINK3"/>
-            <w:r>
-              <w:rPr>
-                <w:i/>
-              </w:rPr>
               <w:fldChar w:fldCharType="begin"/>
             </w:r>
             <w:r>
-              <w:rPr>
-                <w:i/>
-              </w:rPr>
-              <w:instrText xml:space="preserve"> MERGEFIELD  WebinarTitle  \* MERGEFORMAT </w:instrText>
-            </w:r>
-            <w:r>
-              <w:rPr>
-                <w:i/>
-              </w:rPr>
+              <w:instrText xml:space="preserve"> MERGEFIELD  CCCaption  \* MERGEFORMAT </w:instrText>
+            </w:r>
+            <w:r>
               <w:fldChar w:fldCharType="separate"/>
             </w:r>
             <w:r>
               <w:rPr>
-                <w:i/>
-                <w:noProof/>
-              </w:rPr>
-              <w:t>«WebinarTitle»</w:t>
-            </w:r>
-            <w:r>
-              <w:rPr>
-                <w:i/>
+                <w:noProof/>
+              </w:rPr>
+              <w:t>«CCCaption»</w:t>
+            </w:r>
+            <w:r>
+              <w:rPr>
+                <w:noProof/>
               </w:rPr>
               <w:fldChar w:fldCharType="end"/>
             </w:r>
-            <w:bookmarkEnd w:id="1"/>
-            <w:bookmarkEnd w:id="2"/>
-            <w:bookmarkEnd w:id="3"/>
-            <w:r>
-              <w:rPr>
-                <w:i/>
-              </w:rPr>
-              <w:t xml:space="preserve"> </w:t>
-            </w:r>
-            <w:r>
-              <w:t>webinar</w:t>
-            </w:r>
-            <w:r>
-              <w:t>!</w:t>
-            </w:r>
-            <w:r>
-              <w:t xml:space="preserve"> </w:t>
-            </w:r>
-            <w:fldSimple w:instr=" MERGEFIELD  RegDesc  \* MERGEFORMAT ">
+            <w:r>
+              <w:fldChar w:fldCharType="begin"/>
+            </w:r>
+            <w:r>
+              <w:instrText xml:space="preserve"> MERGEFIELD  ExistingAddLocs  \* MERGEFORMAT </w:instrText>
+            </w:r>
+            <w:r>
+              <w:fldChar w:fldCharType="separate"/>
+            </w:r>
+            <w:r>
+              <w:rPr>
+                <w:noProof/>
+              </w:rPr>
+              <w:t>«ExistingAddLocs»</w:t>
+            </w:r>
+            <w:r>
+              <w:rPr>
+                <w:noProof/>
+              </w:rPr>
+              <w:fldChar w:fldCharType="end"/>
+            </w:r>
+            <w:r>
+              <w:t xml:space="preserve">  </w:t>
+            </w:r>
+            <w:fldSimple w:instr=" MERGEFIELD  AddLocsCost  \* MERGEFORMAT ">
               <w:r>
                 <w:rPr>
                   <w:noProof/>
                 </w:rPr>
-                <w:t>«RegDesc»</w:t>
+                <w:t>«AddLocsCost»</w:t>
               </w:r>
             </w:fldSimple>
-            <w:r>
-              <w:t xml:space="preserve"> </w:t>
-            </w:r>
-          </w:p>
-          <w:p>
             <w:bookmarkStart w:id="4" w:name="_GoBack"/>
             <w:bookmarkEnd w:id="4"/>
-          </w:p>
-          <w:p>
-            <w:r>
-              <w:t xml:space="preserve">Everything you need to know about </w:t>
-            </w:r>
-            <w:r>
-              <w:rPr>
-                <w:i/>
-              </w:rPr>
-              <w:t>‘next steps’</w:t>
-            </w:r>
-            <w:r>
-              <w:t xml:space="preserve"> can be found </w:t>
-            </w:r>
-            <w:r>
-              <w:t>below</w:t>
-            </w:r>
-            <w:r>
-              <w:t>:</w:t>
-            </w:r>
-          </w:p>
-          <w:p>
-            <w:pPr>
-              <w:ind w:left="532" w:hanging="532"/>
-              <w:rPr>
-                <w:noProof/>
-              </w:rPr>
-            </w:pPr>
-            <w:r>
-              <w:rPr>
-                <w:b/>
-                <w:i/>
-              </w:rPr>
-              <w:t xml:space="preserve">If you </w:t>
-            </w:r>
-            <w:r>
-              <w:rPr>
-                <w:b/>
-                <w:i/>
-              </w:rPr>
-              <w:t>will be</w:t>
-            </w:r>
-            <w:r>
-              <w:rPr>
-                <w:b/>
-                <w:i/>
-              </w:rPr>
-              <w:t xml:space="preserve"> </w:t>
-            </w:r>
-            <w:r>
-              <w:rPr>
-                <w:b/>
-                <w:i/>
-              </w:rPr>
-              <w:t>attending alone or</w:t>
-            </w:r>
-            <w:r>
-              <w:rPr>
-                <w:b/>
-                <w:i/>
-              </w:rPr>
-              <w:t xml:space="preserve"> with</w:t>
-            </w:r>
-            <w:r>
-              <w:rPr>
-                <w:b/>
-                <w:i/>
-              </w:rPr>
-              <w:t xml:space="preserve"> co-workers</w:t>
-            </w:r>
-            <w:r>
-              <w:rPr>
-                <w:b/>
-                <w:i/>
-              </w:rPr>
-              <w:t xml:space="preserve"> at one location</w:t>
-            </w:r>
-            <w:r>
-              <w:t xml:space="preserve"> – </w:t>
-            </w:r>
-            <w:r>
-              <w:t>everything you need can be found at this link:</w:t>
-            </w:r>
-            <w:r>
-              <w:t xml:space="preserve"> </w:t>
-            </w:r>
-            <w:r>
-              <w:t xml:space="preserve"> </w:t>
-            </w:r>
-            <w:r>
-              <w:fldChar w:fldCharType="begin"/>
-            </w:r>
-            <w:r>
-              <w:instrText xml:space="preserve"> MERGEFIELD  ClickToJoinLink  \* MERGEFORMAT </w:instrText>
-            </w:r>
-            <w:r>
-              <w:fldChar w:fldCharType="separate"/>
-            </w:r>
-            <w:r>
-              <w:rPr>
-                <w:noProof/>
-              </w:rPr>
-              <w:t>«ClickToJoinLink»</w:t>
-            </w:r>
-            <w:r>
-              <w:rPr>
-                <w:noProof/>
-              </w:rPr>
-              <w:fldChar w:fldCharType="end"/>
-            </w:r>
-            <w:r>
-              <w:rPr>
-                <w:noProof/>
-              </w:rPr>
-              <w:t xml:space="preserve"> </w:t>
-            </w:r>
-          </w:p>
-          <w:p/>
-          <w:p>
-            <w:pPr>
-              <w:ind w:left="532" w:hanging="540"/>
-            </w:pPr>
-            <w:r>
-              <w:rPr>
-                <w:b/>
-                <w:i/>
-              </w:rPr>
-              <w:t>If you need to help an associate make the connection to the event</w:t>
-            </w:r>
-            <w:r>
-              <w:t xml:space="preserve"> </w:t>
-            </w:r>
-            <w:fldSimple w:instr=" MERGEFIELD  CCCaption  \* MERGEFORMAT ">
-              <w:r>
-                <w:rPr>
-                  <w:noProof/>
-                </w:rPr>
-                <w:t>«CCCaption»</w:t>
-              </w:r>
-            </w:fldSimple>
-          </w:p>
-          <w:p>
-            <w:pPr>
-              <w:ind w:left="532" w:hanging="540"/>
-            </w:pPr>
-            <w:fldSimple w:instr=" MERGEFIELD  ExistingAddLocs  \* MERGEFORMAT ">
-              <w:r>
-                <w:rPr>
-                  <w:noProof/>
-                </w:rPr>
-                <w:t>«ExistingAddLocs»</w:t>
-              </w:r>
-            </w:fldSimple>
-            <w:r>
-              <w:t xml:space="preserve"> </w:t>
-            </w:r>
-            <w:r>
-              <w:t xml:space="preserve"> </w:t>
-            </w:r>
-            <w:r>
-              <w:fldChar w:fldCharType="begin"/>
-            </w:r>
-            <w:r>
-              <w:instrText xml:space="preserve"> MERGEFIELD  AddLocsCost  \* MERGEFORMAT </w:instrText>
-            </w:r>
-            <w:r>
-              <w:fldChar w:fldCharType="separate"/>
-            </w:r>
-            <w:r>
-              <w:rPr>
-                <w:noProof/>
-              </w:rPr>
-              <w:t>«AddLocsCost»</w:t>
-            </w:r>
-            <w:r>
-              <w:fldChar w:fldCharType="end"/>
-            </w:r>
-            <w:r>
-              <w:t xml:space="preserve">.  </w:t>
-            </w:r>
           </w:p>
           <w:p>
             <w:pPr>
@@ -782,23 +799,7 @@
                 <w:b/>
                 <w:noProof/>
               </w:rPr>
-              <w:t>«</w:t>
-            </w:r>
-            <w:proofErr w:type="spellStart"/>
-            <w:r>
-              <w:rPr>
-                <w:b/>
-                <w:noProof/>
-              </w:rPr>
-              <w:t>ShowStartTime</w:t>
-            </w:r>
-            <w:proofErr w:type="spellEnd"/>
-            <w:r>
-              <w:rPr>
-                <w:b/>
-                <w:noProof/>
-              </w:rPr>
-              <w:t>»</w:t>
+              <w:t>«ShowStartTime»</w:t>
             </w:r>
             <w:r>
               <w:rPr>
@@ -830,14 +831,27 @@
             <w:r>
               <w:t xml:space="preserve"> </w:t>
             </w:r>
-            <w:fldSimple w:instr=" MERGEFIELD  ShowTimeZone  \* MERGEFORMAT ">
-              <w:r>
-                <w:rPr>
-                  <w:noProof/>
-                </w:rPr>
-                <w:t>«ShowTimeZone»</w:t>
-              </w:r>
-            </w:fldSimple>
+            <w:r>
+              <w:fldChar w:fldCharType="begin"/>
+            </w:r>
+            <w:r>
+              <w:instrText xml:space="preserve"> MERGEFIELD  ShowTimeZone  \* MERGEFORMAT </w:instrText>
+            </w:r>
+            <w:r>
+              <w:fldChar w:fldCharType="separate"/>
+            </w:r>
+            <w:r>
+              <w:rPr>
+                <w:noProof/>
+              </w:rPr>
+              <w:t>«ShowTimeZone»</w:t>
+            </w:r>
+            <w:r>
+              <w:rPr>
+                <w:noProof/>
+              </w:rPr>
+              <w:fldChar w:fldCharType="end"/>
+            </w:r>
             <w:r>
               <w:rPr>
                 <w:b/>
@@ -855,27 +869,32 @@
               <w:t xml:space="preserve"> our notifications to use</w:t>
             </w:r>
             <w:r>
-              <w:t xml:space="preserve"> a different </w:t>
-            </w:r>
-            <w:proofErr w:type="spellStart"/>
-            <w:r>
-              <w:t>timezone</w:t>
-            </w:r>
-            <w:proofErr w:type="spellEnd"/>
-            <w:r>
-              <w:t xml:space="preserve"> please </w:t>
+              <w:t xml:space="preserve"> a different timezone please </w:t>
             </w:r>
             <w:r>
               <w:t xml:space="preserve"> </w:t>
             </w:r>
-            <w:fldSimple w:instr=" MERGEFIELD  ChangeTimeZoneLink  \* MERGEFORMAT ">
-              <w:r>
-                <w:rPr>
-                  <w:noProof/>
-                </w:rPr>
-                <w:t>«ChangeTimeZoneLink»</w:t>
-              </w:r>
-            </w:fldSimple>
+            <w:r>
+              <w:fldChar w:fldCharType="begin"/>
+            </w:r>
+            <w:r>
+              <w:instrText xml:space="preserve"> MERGEFIELD  ChangeTimeZoneLink  \* MERGEFORMAT </w:instrText>
+            </w:r>
+            <w:r>
+              <w:fldChar w:fldCharType="separate"/>
+            </w:r>
+            <w:r>
+              <w:rPr>
+                <w:noProof/>
+              </w:rPr>
+              <w:t>«ChangeTimeZoneLink»</w:t>
+            </w:r>
+            <w:r>
+              <w:rPr>
+                <w:noProof/>
+              </w:rPr>
+              <w:fldChar w:fldCharType="end"/>
+            </w:r>
             <w:r>
               <w:t>.</w:t>
             </w:r>
@@ -902,25 +921,51 @@
             <w:r>
               <w:t xml:space="preserve"> </w:t>
             </w:r>
-            <w:fldSimple w:instr=" MERGEFIELD  AddReminder  \* MERGEFORMAT ">
-              <w:r>
-                <w:rPr>
-                  <w:noProof/>
-                </w:rPr>
-                <w:t>«AddReminder»</w:t>
-              </w:r>
-            </w:fldSimple>
+            <w:r>
+              <w:fldChar w:fldCharType="begin"/>
+            </w:r>
+            <w:r>
+              <w:instrText xml:space="preserve"> MERGEFIELD  AddReminder  \* MERGEFORMAT </w:instrText>
+            </w:r>
+            <w:r>
+              <w:fldChar w:fldCharType="separate"/>
+            </w:r>
+            <w:r>
+              <w:rPr>
+                <w:noProof/>
+              </w:rPr>
+              <w:t>«AddReminder»</w:t>
+            </w:r>
+            <w:r>
+              <w:rPr>
+                <w:noProof/>
+              </w:rPr>
+              <w:fldChar w:fldCharType="end"/>
+            </w:r>
           </w:p>
           <w:p/>
           <w:p>
-            <w:fldSimple w:instr=" MERGEFIELD  PaymentCaption  \* MERGEFORMAT ">
-              <w:r>
-                <w:rPr>
-                  <w:noProof/>
-                </w:rPr>
-                <w:t>«PaymentCaption»</w:t>
-              </w:r>
-            </w:fldSimple>
+            <w:r>
+              <w:fldChar w:fldCharType="begin"/>
+            </w:r>
+            <w:r>
+              <w:instrText xml:space="preserve"> MERGEFIELD  PaymentCaption  \* MERGEFORMAT </w:instrText>
+            </w:r>
+            <w:r>
+              <w:fldChar w:fldCharType="separate"/>
+            </w:r>
+            <w:r>
+              <w:rPr>
+                <w:noProof/>
+              </w:rPr>
+              <w:t>«PaymentCaption»</w:t>
+            </w:r>
+            <w:r>
+              <w:rPr>
+                <w:noProof/>
+              </w:rPr>
+              <w:fldChar w:fldCharType="end"/>
+            </w:r>
           </w:p>
           <w:p>
             <w:pPr>
@@ -931,14 +976,27 @@
             <w:r>
               <w:t xml:space="preserve">The customer service staff at </w:t>
             </w:r>
-            <w:fldSimple w:instr=" MERGEFIELD  TenantName  \* MERGEFORMAT ">
-              <w:r>
-                <w:rPr>
-                  <w:noProof/>
-                </w:rPr>
-                <w:t>«TenantName»</w:t>
-              </w:r>
-            </w:fldSimple>
+            <w:r>
+              <w:fldChar w:fldCharType="begin"/>
+            </w:r>
+            <w:r>
+              <w:instrText xml:space="preserve"> MERGEFIELD  TenantName  \* MERGEFORMAT </w:instrText>
+            </w:r>
+            <w:r>
+              <w:fldChar w:fldCharType="separate"/>
+            </w:r>
+            <w:r>
+              <w:rPr>
+                <w:noProof/>
+              </w:rPr>
+              <w:t>«TenantName»</w:t>
+            </w:r>
+            <w:r>
+              <w:rPr>
+                <w:noProof/>
+              </w:rPr>
+              <w:fldChar w:fldCharType="end"/>
+            </w:r>
             <w:r>
               <w:t xml:space="preserve"> is confident you’ll find both </w:t>
             </w:r>
@@ -966,14 +1024,30 @@
             <w:r>
               <w:t xml:space="preserve"> visit our online chat where you’ll find a professional representative waiting to make sure your satisfaction is restored. </w:t>
             </w:r>
-            <w:fldSimple w:instr=" MERGEFIELD  TechSupportLink  \* MERGEFORMAT ">
-              <w:r>
-                <w:rPr>
-                  <w:noProof/>
-                </w:rPr>
-                <w:t>«TechSupportLink»</w:t>
-              </w:r>
-            </w:fldSimple>
+            <w:r>
+              <w:fldChar w:fldCharType="begin"/>
+            </w:r>
+            <w:r>
+              <w:instrText xml:space="preserve"> MERGEFIE</w:instrText>
+            </w:r>
+            <w:r>
+              <w:instrText xml:space="preserve">LD  TechSupportLink  \* MERGEFORMAT </w:instrText>
+            </w:r>
+            <w:r>
+              <w:fldChar w:fldCharType="separate"/>
+            </w:r>
+            <w:r>
+              <w:rPr>
+                <w:noProof/>
+              </w:rPr>
+              <w:t>«TechSupportLink»</w:t>
+            </w:r>
+            <w:r>
+              <w:rPr>
+                <w:noProof/>
+              </w:rPr>
+              <w:fldChar w:fldCharType="end"/>
+            </w:r>
             <w:r>
               <w:t>.</w:t>
             </w:r>
@@ -1804,7 +1878,7 @@
 </file>
 
 <file path=customXml/itemProps1.xml><?xml version="1.0" encoding="utf-8"?>
-<ds:datastoreItem xmlns:ds="http://schemas.openxmlformats.org/officeDocument/2006/customXml" ds:itemID="{A1421FC4-90EB-47D6-9A82-237D932C3823}">
+<ds:datastoreItem xmlns:ds="http://schemas.openxmlformats.org/officeDocument/2006/customXml" ds:itemID="{F0C3FFBB-0BB0-4A7A-82ED-6299E7449217}">
   <ds:schemaRefs>
     <ds:schemaRef ds:uri="http://schemas.openxmlformats.org/officeDocument/2006/bibliography"/>
   </ds:schemaRefs>

</xml_diff>

<commit_message>
MW Frontpage and draft of Confirmation template
</commit_message>
<xml_diff>
--- a/CUWebinars.Web/App_Data/mergeTemplates/OrderSubmitted_PreEvent.docx
+++ b/CUWebinars.Web/App_Data/mergeTemplates/OrderSubmitted_PreEvent.docx
@@ -17,17 +17,18 @@
         <w:tblLook w:val="04A0" w:firstRow="1" w:lastRow="0" w:firstColumn="1" w:lastColumn="0" w:noHBand="0" w:noVBand="1"/>
       </w:tblPr>
       <w:tblGrid>
-        <w:gridCol w:w="262"/>
-        <w:gridCol w:w="6000"/>
+        <w:gridCol w:w="260"/>
+        <w:gridCol w:w="4420"/>
+        <w:gridCol w:w="1585"/>
         <w:gridCol w:w="2835"/>
-        <w:gridCol w:w="263"/>
+        <w:gridCol w:w="260"/>
       </w:tblGrid>
       <w:tr>
         <w:tc>
           <w:tcPr>
-            <w:tcW w:w="9351" w:type="dxa"/>
-            <w:gridSpan w:val="4"/>
-            <w:shd w:val="clear" w:color="auto" w:fill="4D677F"/>
+            <w:tcW w:w="9360" w:type="dxa"/>
+            <w:gridSpan w:val="5"/>
+            <w:shd w:val="clear" w:color="auto" w:fill="3E67B1"/>
           </w:tcPr>
           <w:p>
             <w:pPr>
@@ -59,7 +60,22 @@
                 <w:i/>
                 <w:noProof/>
               </w:rPr>
-              <w:t>«MessageHeading»</w:t>
+              <w:t>«</w:t>
+            </w:r>
+            <w:r>
+              <w:rPr>
+                <w:i/>
+                <w:noProof/>
+                <w:color w:val="FFFFFF" w:themeColor="background1"/>
+              </w:rPr>
+              <w:t>MessageHeading</w:t>
+            </w:r>
+            <w:r>
+              <w:rPr>
+                <w:i/>
+                <w:noProof/>
+              </w:rPr>
+              <w:t>»</w:t>
             </w:r>
             <w:r>
               <w:rPr>
@@ -73,43 +89,84 @@
       <w:tr>
         <w:tc>
           <w:tcPr>
-            <w:tcW w:w="265" w:type="dxa"/>
+            <w:tcW w:w="260" w:type="dxa"/>
             <w:tcBorders>
               <w:right w:val="single" w:sz="4" w:space="0" w:color="000000"/>
             </w:tcBorders>
-            <w:shd w:val="clear" w:color="auto" w:fill="4D677F"/>
+            <w:shd w:val="clear" w:color="auto" w:fill="3E67B1"/>
           </w:tcPr>
           <w:p/>
         </w:tc>
         <w:tc>
           <w:tcPr>
-            <w:tcW w:w="6305" w:type="dxa"/>
+            <w:tcW w:w="6005" w:type="dxa"/>
+            <w:gridSpan w:val="2"/>
             <w:tcBorders>
               <w:top w:val="single" w:sz="4" w:space="0" w:color="000000"/>
               <w:left w:val="single" w:sz="4" w:space="0" w:color="000000"/>
             </w:tcBorders>
-            <w:shd w:val="clear" w:color="auto" w:fill="4B5966"/>
+            <w:shd w:val="clear" w:color="auto" w:fill="D0CECE" w:themeFill="background2" w:themeFillShade="E6"/>
           </w:tcPr>
           <w:p>
             <w:pPr>
-              <w:rPr>
-                <w:noProof/>
-              </w:rPr>
+              <w:tabs>
+                <w:tab w:val="left" w:pos="3372"/>
+              </w:tabs>
             </w:pPr>
-            <w:bookmarkStart w:id="0" w:name="OLE_LINK6"/>
-            <w:r>
-              <w:rPr>
-                <w:noProof/>
-              </w:rPr>
-              <w:t>[logo]</w:t>
+            <w:r>
+              <w:rPr>
+                <w:noProof/>
+              </w:rPr>
+              <w:drawing>
+                <wp:inline distT="0" distB="0" distL="0" distR="0" wp14:anchorId="0CF66937" wp14:editId="7866C50E">
+                  <wp:extent cx="2529840" cy="632461"/>
+                  <wp:effectExtent l="0" t="0" r="3810" b="0"/>
+                  <wp:docPr id="1" name="Picture 1"/>
+                  <wp:cNvGraphicFramePr>
+                    <a:graphicFrameLocks xmlns:a="http://schemas.openxmlformats.org/drawingml/2006/main" noChangeAspect="1"/>
+                  </wp:cNvGraphicFramePr>
+                  <a:graphic xmlns:a="http://schemas.openxmlformats.org/drawingml/2006/main">
+                    <a:graphicData uri="http://schemas.openxmlformats.org/drawingml/2006/picture">
+                      <pic:pic xmlns:pic="http://schemas.openxmlformats.org/drawingml/2006/picture">
+                        <pic:nvPicPr>
+                          <pic:cNvPr id="1" name="logo_mortgagewebinars.png"/>
+                          <pic:cNvPicPr/>
+                        </pic:nvPicPr>
+                        <pic:blipFill>
+                          <a:blip r:embed="rId5">
+                            <a:extLst>
+                              <a:ext uri="{28A0092B-C50C-407E-A947-70E740481C1C}">
+                                <a14:useLocalDpi xmlns:a14="http://schemas.microsoft.com/office/drawing/2010/main" val="0"/>
+                              </a:ext>
+                            </a:extLst>
+                          </a:blip>
+                          <a:stretch>
+                            <a:fillRect/>
+                          </a:stretch>
+                        </pic:blipFill>
+                        <pic:spPr>
+                          <a:xfrm>
+                            <a:off x="0" y="0"/>
+                            <a:ext cx="2594800" cy="648701"/>
+                          </a:xfrm>
+                          <a:prstGeom prst="rect">
+                            <a:avLst/>
+                          </a:prstGeom>
+                        </pic:spPr>
+                      </pic:pic>
+                    </a:graphicData>
+                  </a:graphic>
+                </wp:inline>
+              </w:drawing>
+            </w:r>
+            <w:r>
+              <w:tab/>
             </w:r>
           </w:p>
-          <w:bookmarkEnd w:id="0"/>
-          <w:p/>
         </w:tc>
         <w:tc>
           <w:tcPr>
-            <w:tcW w:w="2516" w:type="dxa"/>
+            <w:tcW w:w="2835" w:type="dxa"/>
             <w:tcBorders>
               <w:top w:val="single" w:sz="4" w:space="0" w:color="000000"/>
               <w:right w:val="single" w:sz="4" w:space="0" w:color="000000"/>
@@ -236,7 +293,7 @@
                       <w:szCs w:val="18"/>
                     </w:rPr>
                   </w:pPr>
-                  <w:bookmarkStart w:id="1" w:name="_Hlk486160287"/>
+                  <w:bookmarkStart w:id="0" w:name="_Hlk486160287"/>
                   <w:r>
                     <w:rPr>
                       <w:color w:val="7F7F7F" w:themeColor="text1" w:themeTint="80"/>
@@ -298,7 +355,7 @@
                 </w:p>
               </w:tc>
             </w:tr>
-            <w:bookmarkEnd w:id="1"/>
+            <w:bookmarkEnd w:id="0"/>
             <w:tr>
               <w:tc>
                 <w:tcPr>
@@ -460,11 +517,39 @@
         </w:tc>
         <w:tc>
           <w:tcPr>
-            <w:tcW w:w="265" w:type="dxa"/>
+            <w:tcW w:w="260" w:type="dxa"/>
             <w:tcBorders>
               <w:left w:val="single" w:sz="4" w:space="0" w:color="000000"/>
             </w:tcBorders>
-            <w:shd w:val="clear" w:color="auto" w:fill="4D677F"/>
+            <w:shd w:val="clear" w:color="auto" w:fill="3E67B1"/>
+          </w:tcPr>
+          <w:p/>
+          <w:p/>
+        </w:tc>
+      </w:tr>
+      <w:tr>
+        <w:tc>
+          <w:tcPr>
+            <w:tcW w:w="260" w:type="dxa"/>
+            <w:shd w:val="clear" w:color="auto" w:fill="3E67B1"/>
+          </w:tcPr>
+          <w:p/>
+        </w:tc>
+        <w:tc>
+          <w:tcPr>
+            <w:tcW w:w="8840" w:type="dxa"/>
+            <w:gridSpan w:val="3"/>
+            <w:shd w:val="clear" w:color="auto" w:fill="3E67B1"/>
+          </w:tcPr>
+          <w:p/>
+        </w:tc>
+        <w:tc>
+          <w:tcPr>
+            <w:tcW w:w="260" w:type="dxa"/>
+            <w:tcBorders>
+              <w:left w:val="nil"/>
+            </w:tcBorders>
+            <w:shd w:val="clear" w:color="auto" w:fill="3E67B1"/>
           </w:tcPr>
           <w:p/>
         </w:tc>
@@ -472,52 +557,18 @@
       <w:tr>
         <w:tc>
           <w:tcPr>
-            <w:tcW w:w="265" w:type="dxa"/>
+            <w:tcW w:w="260" w:type="dxa"/>
             <w:tcBorders>
               <w:right w:val="single" w:sz="4" w:space="0" w:color="auto"/>
             </w:tcBorders>
-            <w:shd w:val="clear" w:color="auto" w:fill="4D677F"/>
+            <w:shd w:val="clear" w:color="auto" w:fill="3E67B1"/>
           </w:tcPr>
           <w:p/>
         </w:tc>
         <w:tc>
           <w:tcPr>
-            <w:tcW w:w="8821" w:type="dxa"/>
-            <w:gridSpan w:val="2"/>
-            <w:tcBorders>
-              <w:left w:val="single" w:sz="4" w:space="0" w:color="auto"/>
-              <w:right w:val="single" w:sz="4" w:space="0" w:color="auto"/>
-            </w:tcBorders>
-            <w:shd w:val="clear" w:color="auto" w:fill="000000" w:themeFill="text1"/>
-          </w:tcPr>
-          <w:p/>
-        </w:tc>
-        <w:tc>
-          <w:tcPr>
-            <w:tcW w:w="265" w:type="dxa"/>
-            <w:tcBorders>
-              <w:left w:val="single" w:sz="4" w:space="0" w:color="auto"/>
-            </w:tcBorders>
-            <w:shd w:val="clear" w:color="auto" w:fill="4D677F"/>
-          </w:tcPr>
-          <w:p/>
-        </w:tc>
-      </w:tr>
-      <w:tr>
-        <w:tc>
-          <w:tcPr>
-            <w:tcW w:w="265" w:type="dxa"/>
-            <w:tcBorders>
-              <w:right w:val="single" w:sz="4" w:space="0" w:color="auto"/>
-            </w:tcBorders>
-            <w:shd w:val="clear" w:color="auto" w:fill="4D677F"/>
-          </w:tcPr>
-          <w:p/>
-        </w:tc>
-        <w:tc>
-          <w:tcPr>
-            <w:tcW w:w="8821" w:type="dxa"/>
-            <w:gridSpan w:val="2"/>
+            <w:tcW w:w="8840" w:type="dxa"/>
+            <w:gridSpan w:val="3"/>
             <w:tcBorders>
               <w:left w:val="single" w:sz="4" w:space="0" w:color="auto"/>
               <w:right w:val="single" w:sz="6" w:space="0" w:color="auto"/>
@@ -528,117 +579,126 @@
             <w:r>
               <w:t xml:space="preserve">Dear </w:t>
             </w:r>
-            <w:r>
-              <w:fldChar w:fldCharType="begin"/>
-            </w:r>
-            <w:r>
-              <w:instrText xml:space="preserve"> MERGEFIELD  FirstName  \* MERGEFORMAT </w:instrText>
-            </w:r>
-            <w:r>
-              <w:fldChar w:fldCharType="separate"/>
-            </w:r>
-            <w:r>
-              <w:rPr>
-                <w:noProof/>
-              </w:rPr>
-              <w:t>«FirstName»</w:t>
-            </w:r>
-            <w:r>
-              <w:rPr>
-                <w:noProof/>
-              </w:rPr>
-              <w:fldChar w:fldCharType="end"/>
-            </w:r>
-            <w:r>
-              <w:t>,</w:t>
-            </w:r>
-          </w:p>
-          <w:p/>
-          <w:p>
-            <w:r>
-              <w:t>Thank</w:t>
-            </w:r>
-            <w:r>
-              <w:t xml:space="preserve"> you</w:t>
-            </w:r>
-            <w:r>
-              <w:t xml:space="preserve"> for your</w:t>
-            </w:r>
-            <w:r>
-              <w:t xml:space="preserve"> </w:t>
-            </w:r>
-            <w:r>
-              <w:t xml:space="preserve">order </w:t>
-            </w:r>
-            <w:r>
-              <w:t>for</w:t>
-            </w:r>
-            <w:r>
-              <w:t xml:space="preserve"> the</w:t>
-            </w:r>
-            <w:r>
-              <w:t xml:space="preserve"> </w:t>
-            </w:r>
-            <w:bookmarkStart w:id="2" w:name="OLE_LINK1"/>
-            <w:bookmarkStart w:id="3" w:name="OLE_LINK2"/>
-            <w:bookmarkStart w:id="4" w:name="OLE_LINK3"/>
-            <w:r>
-              <w:rPr>
-                <w:i/>
-              </w:rPr>
-              <w:fldChar w:fldCharType="begin"/>
-            </w:r>
-            <w:r>
-              <w:rPr>
-                <w:i/>
-              </w:rPr>
-              <w:instrText xml:space="preserve"> MERGEFIELD  WebinarTitle  \* MERGEFORMAT </w:instrText>
-            </w:r>
-            <w:r>
-              <w:rPr>
-                <w:i/>
-              </w:rPr>
-              <w:fldChar w:fldCharType="separate"/>
-            </w:r>
-            <w:r>
-              <w:rPr>
-                <w:i/>
-                <w:noProof/>
-              </w:rPr>
-              <w:t>«WebinarTitle»</w:t>
-            </w:r>
-            <w:r>
-              <w:rPr>
-                <w:i/>
-              </w:rPr>
-              <w:fldChar w:fldCharType="end"/>
-            </w:r>
-            <w:bookmarkEnd w:id="2"/>
-            <w:bookmarkEnd w:id="3"/>
-            <w:bookmarkEnd w:id="4"/>
-            <w:r>
-              <w:rPr>
-                <w:i/>
-              </w:rPr>
-              <w:t xml:space="preserve"> </w:t>
-            </w:r>
-            <w:r>
-              <w:t>webinar</w:t>
-            </w:r>
-            <w:r>
-              <w:t>!</w:t>
-            </w:r>
-            <w:r>
-              <w:t xml:space="preserve"> </w:t>
-            </w:r>
-            <w:fldSimple w:instr=" MERGEFIELD  AddReminder  \* MERGEFORMAT ">
+            <w:fldSimple w:instr=" MERGEFIELD  FirstName  \* MERGEFORMAT ">
               <w:r>
                 <w:rPr>
                   <w:noProof/>
                 </w:rPr>
-                <w:t>«AddReminder»</w:t>
+                <w:t>«FirstName»</w:t>
               </w:r>
             </w:fldSimple>
+            <w:r>
+              <w:t>,</w:t>
+            </w:r>
+          </w:p>
+          <w:p/>
+          <w:p>
+            <w:r>
+              <w:t>Thank</w:t>
+            </w:r>
+            <w:r>
+              <w:t xml:space="preserve"> you</w:t>
+            </w:r>
+            <w:r>
+              <w:t xml:space="preserve"> for your</w:t>
+            </w:r>
+            <w:r>
+              <w:t xml:space="preserve"> </w:t>
+            </w:r>
+            <w:r>
+              <w:t xml:space="preserve">order </w:t>
+            </w:r>
+            <w:r>
+              <w:t>for</w:t>
+            </w:r>
+            <w:r>
+              <w:t xml:space="preserve"> the</w:t>
+            </w:r>
+            <w:r>
+              <w:t xml:space="preserve"> </w:t>
+            </w:r>
+            <w:bookmarkStart w:id="1" w:name="OLE_LINK1"/>
+            <w:bookmarkStart w:id="2" w:name="OLE_LINK2"/>
+            <w:bookmarkStart w:id="3" w:name="OLE_LINK3"/>
+            <w:r>
+              <w:rPr>
+                <w:i/>
+              </w:rPr>
+              <w:fldChar w:fldCharType="begin"/>
+            </w:r>
+            <w:r>
+              <w:rPr>
+                <w:i/>
+              </w:rPr>
+              <w:instrText xml:space="preserve"> MERGEFIELD  WebinarTitle  \* MERGEFORMAT </w:instrText>
+            </w:r>
+            <w:r>
+              <w:rPr>
+                <w:i/>
+              </w:rPr>
+              <w:fldChar w:fldCharType="separate"/>
+            </w:r>
+            <w:r>
+              <w:rPr>
+                <w:i/>
+                <w:noProof/>
+              </w:rPr>
+              <w:t>«WebinarTitle»</w:t>
+            </w:r>
+            <w:r>
+              <w:rPr>
+                <w:i/>
+              </w:rPr>
+              <w:fldChar w:fldCharType="end"/>
+            </w:r>
+            <w:bookmarkEnd w:id="1"/>
+            <w:bookmarkEnd w:id="2"/>
+            <w:bookmarkEnd w:id="3"/>
+            <w:r>
+              <w:rPr>
+                <w:i/>
+              </w:rPr>
+              <w:t xml:space="preserve"> </w:t>
+            </w:r>
+            <w:r>
+              <w:t>webinar</w:t>
+            </w:r>
+            <w:r>
+              <w:t>!</w:t>
+            </w:r>
+            <w:r>
+              <w:t xml:space="preserve"> </w:t>
+            </w:r>
+            <w:r>
+              <w:rPr>
+                <w:noProof/>
+              </w:rPr>
+              <w:fldChar w:fldCharType="begin"/>
+            </w:r>
+            <w:r>
+              <w:rPr>
+                <w:noProof/>
+              </w:rPr>
+              <w:instrText xml:space="preserve"> MERGEFIELD  AddReminder  \* MERGEFORMAT </w:instrText>
+            </w:r>
+            <w:r>
+              <w:rPr>
+                <w:noProof/>
+              </w:rPr>
+              <w:fldChar w:fldCharType="separate"/>
+            </w:r>
+            <w:r>
+              <w:rPr>
+                <w:noProof/>
+              </w:rPr>
+              <w:t>«AddReminder»</w:t>
+            </w:r>
+            <w:r>
+              <w:rPr>
+                <w:noProof/>
+              </w:rPr>
+              <w:fldChar w:fldCharType="end"/>
+            </w:r>
           </w:p>
           <w:p/>
           <w:p>
@@ -715,116 +775,164 @@
             <w:r>
               <w:t xml:space="preserve"> </w:t>
             </w:r>
-            <w:fldSimple w:instr=" MERGEFIELD  ClickToJoinLink  \* MERGEFORMAT ">
+            <w:r>
+              <w:rPr>
+                <w:noProof/>
+              </w:rPr>
+              <w:fldChar w:fldCharType="begin"/>
+            </w:r>
+            <w:r>
+              <w:rPr>
+                <w:noProof/>
+              </w:rPr>
+              <w:instrText xml:space="preserve"> MERGEFIELD  ClickToJoinLink  \* MERGEFORMAT </w:instrText>
+            </w:r>
+            <w:r>
+              <w:rPr>
+                <w:noProof/>
+              </w:rPr>
+              <w:fldChar w:fldCharType="separate"/>
+            </w:r>
+            <w:r>
+              <w:rPr>
+                <w:noProof/>
+              </w:rPr>
+              <w:t>«Click</w:t>
+            </w:r>
+            <w:bookmarkStart w:id="4" w:name="_GoBack"/>
+            <w:bookmarkEnd w:id="4"/>
+            <w:r>
+              <w:rPr>
+                <w:noProof/>
+              </w:rPr>
+              <w:t>ToJoinLink»</w:t>
+            </w:r>
+            <w:r>
+              <w:rPr>
+                <w:noProof/>
+              </w:rPr>
+              <w:fldChar w:fldCharType="end"/>
+            </w:r>
+            <w:r>
+              <w:rPr>
+                <w:noProof/>
+              </w:rPr>
+              <w:t xml:space="preserve"> </w:t>
+            </w:r>
+          </w:p>
+          <w:p/>
+          <w:p>
+            <w:r>
+              <w:rPr>
+                <w:b/>
+                <w:i/>
+              </w:rPr>
+              <w:t>If you need to help an associate make the connection to the event</w:t>
+            </w:r>
+            <w:r>
+              <w:rPr>
+                <w:b/>
+                <w:i/>
+              </w:rPr>
+              <w:t xml:space="preserve"> -</w:t>
+            </w:r>
+            <w:r>
+              <w:t xml:space="preserve"> </w:t>
+            </w:r>
+            <w:fldSimple w:instr=" MERGEFIELD  CCCaption  \* MERGEFORMAT ">
               <w:r>
                 <w:rPr>
                   <w:noProof/>
                 </w:rPr>
-                <w:t>«ClickToJoinLink»</w:t>
+                <w:t>«CCCaption»</w:t>
               </w:r>
             </w:fldSimple>
-            <w:r>
-              <w:rPr>
-                <w:noProof/>
-              </w:rPr>
-              <w:t xml:space="preserve"> </w:t>
-            </w:r>
-          </w:p>
-          <w:p/>
-          <w:p>
-            <w:r>
-              <w:rPr>
-                <w:b/>
-                <w:i/>
-              </w:rPr>
-              <w:t>If you need to help an associate make the connection to the event</w:t>
-            </w:r>
-            <w:r>
-              <w:rPr>
-                <w:b/>
-                <w:i/>
-              </w:rPr>
-              <w:t xml:space="preserve"> -</w:t>
-            </w:r>
-            <w:r>
-              <w:t xml:space="preserve"> </w:t>
-            </w:r>
-            <w:r>
-              <w:fldChar w:fldCharType="begin"/>
-            </w:r>
-            <w:r>
-              <w:instrText xml:space="preserve"> MERGEFIELD  CCCaption  \* MERGEFORMAT </w:instrText>
-            </w:r>
-            <w:r>
-              <w:fldChar w:fldCharType="separate"/>
-            </w:r>
-            <w:r>
-              <w:rPr>
-                <w:noProof/>
-              </w:rPr>
-              <w:t>«CCCaption»</w:t>
-            </w:r>
-            <w:r>
-              <w:rPr>
-                <w:noProof/>
-              </w:rPr>
-              <w:fldChar w:fldCharType="end"/>
-            </w:r>
-            <w:r>
-              <w:fldChar w:fldCharType="begin"/>
-            </w:r>
-            <w:r>
-              <w:instrText xml:space="preserve"> MERGEFIELD  ExistingAddLocs  \* MERGEFORMAT </w:instrText>
-            </w:r>
-            <w:r>
-              <w:fldChar w:fldCharType="separate"/>
-            </w:r>
-            <w:r>
-              <w:rPr>
-                <w:noProof/>
-              </w:rPr>
-              <w:t>«ExistingAddLocs»</w:t>
-            </w:r>
-            <w:r>
-              <w:rPr>
-                <w:noProof/>
-              </w:rPr>
-              <w:fldChar w:fldCharType="end"/>
-            </w:r>
-            <w:r>
-              <w:t xml:space="preserve"> </w:t>
-            </w:r>
-            <w:r>
-              <w:rPr>
-                <w:noProof/>
-              </w:rPr>
-              <w:t>To update addresses t</w:t>
-            </w:r>
-            <w:r>
-              <w:rPr>
-                <w:noProof/>
-              </w:rPr>
-              <w:t xml:space="preserve">his event is shared with visit our </w:t>
-            </w:r>
-            <w:fldSimple w:instr=" MERGEFIELD  UpdateOrderPage  \* MERGEFORMAT ">
+            <w:fldSimple w:instr=" MERGEFIELD  ExistingAddLocs  \* MERGEFORMAT ">
               <w:r>
                 <w:rPr>
                   <w:noProof/>
                 </w:rPr>
-                <w:t>«UpdateOrderPage»</w:t>
+                <w:t>«ExistingAddLocs»</w:t>
               </w:r>
             </w:fldSimple>
+            <w:r>
+              <w:t xml:space="preserve"> </w:t>
+            </w:r>
+            <w:r>
+              <w:rPr>
+                <w:noProof/>
+              </w:rPr>
+              <w:t>To update addresses t</w:t>
+            </w:r>
+            <w:r>
+              <w:rPr>
+                <w:noProof/>
+              </w:rPr>
+              <w:t xml:space="preserve">his event is shared with visit our </w:t>
+            </w:r>
+            <w:r>
+              <w:rPr>
+                <w:noProof/>
+              </w:rPr>
+              <w:fldChar w:fldCharType="begin"/>
+            </w:r>
+            <w:r>
+              <w:rPr>
+                <w:noProof/>
+              </w:rPr>
+              <w:instrText xml:space="preserve"> MERGEFIELD  UpdateOrderPage  \* MERGEFORMAT </w:instrText>
+            </w:r>
+            <w:r>
+              <w:rPr>
+                <w:noProof/>
+              </w:rPr>
+              <w:fldChar w:fldCharType="separate"/>
+            </w:r>
+            <w:r>
+              <w:rPr>
+                <w:noProof/>
+              </w:rPr>
+              <w:t>«UpdateOrderPage»</w:t>
+            </w:r>
+            <w:r>
+              <w:rPr>
+                <w:noProof/>
+              </w:rPr>
+              <w:fldChar w:fldCharType="end"/>
+            </w:r>
           </w:p>
           <w:p/>
           <w:p>
-            <w:fldSimple w:instr=" MERGEFIELD  PaymentCaption  \* MERGEFORMAT ">
-              <w:r>
-                <w:rPr>
-                  <w:noProof/>
-                </w:rPr>
-                <w:t>«PaymentCaption»</w:t>
-              </w:r>
-            </w:fldSimple>
+            <w:r>
+              <w:rPr>
+                <w:noProof/>
+              </w:rPr>
+              <w:fldChar w:fldCharType="begin"/>
+            </w:r>
+            <w:r>
+              <w:rPr>
+                <w:noProof/>
+              </w:rPr>
+              <w:instrText xml:space="preserve"> MERGEFIELD  PaymentCaption  \* MERGEFORMAT </w:instrText>
+            </w:r>
+            <w:r>
+              <w:rPr>
+                <w:noProof/>
+              </w:rPr>
+              <w:fldChar w:fldCharType="separate"/>
+            </w:r>
+            <w:r>
+              <w:rPr>
+                <w:noProof/>
+              </w:rPr>
+              <w:t>«PaymentCaption»</w:t>
+            </w:r>
+            <w:r>
+              <w:rPr>
+                <w:noProof/>
+              </w:rPr>
+              <w:fldChar w:fldCharType="end"/>
+            </w:r>
           </w:p>
           <w:p>
             <w:pPr>
@@ -949,14 +1057,36 @@
             <w:r>
               <w:t xml:space="preserve">zone please </w:t>
             </w:r>
-            <w:fldSimple w:instr=" MERGEFIELD  ChangeTimeZoneLink  \* MERGEFORMAT ">
-              <w:r>
-                <w:rPr>
-                  <w:noProof/>
-                </w:rPr>
-                <w:t>«ChangeTimeZoneLink»</w:t>
-              </w:r>
-            </w:fldSimple>
+            <w:r>
+              <w:rPr>
+                <w:noProof/>
+              </w:rPr>
+              <w:fldChar w:fldCharType="begin"/>
+            </w:r>
+            <w:r>
+              <w:rPr>
+                <w:noProof/>
+              </w:rPr>
+              <w:instrText xml:space="preserve"> MERGEFIELD  ChangeTimeZoneLink  \* MERGEFORMAT </w:instrText>
+            </w:r>
+            <w:r>
+              <w:rPr>
+                <w:noProof/>
+              </w:rPr>
+              <w:fldChar w:fldCharType="separate"/>
+            </w:r>
+            <w:r>
+              <w:rPr>
+                <w:noProof/>
+              </w:rPr>
+              <w:t>«ChangeTimeZoneLink»</w:t>
+            </w:r>
+            <w:r>
+              <w:rPr>
+                <w:noProof/>
+              </w:rPr>
+              <w:fldChar w:fldCharType="end"/>
+            </w:r>
           </w:p>
           <w:p/>
           <w:p>
@@ -976,14 +1106,36 @@
             <w:r>
               <w:t xml:space="preserve">) can be viewed at </w:t>
             </w:r>
-            <w:fldSimple w:instr=" MERGEFIELD  DetailedConnectionInfoLink  \* MERGEFORMAT ">
-              <w:r>
-                <w:rPr>
-                  <w:noProof/>
-                </w:rPr>
-                <w:t>«DetailedConnectionInfoLink»</w:t>
-              </w:r>
-            </w:fldSimple>
+            <w:r>
+              <w:rPr>
+                <w:noProof/>
+              </w:rPr>
+              <w:fldChar w:fldCharType="begin"/>
+            </w:r>
+            <w:r>
+              <w:rPr>
+                <w:noProof/>
+              </w:rPr>
+              <w:instrText xml:space="preserve"> MERGEFIELD  DetailedConnectionInfoLink  \* MERGEFORMAT </w:instrText>
+            </w:r>
+            <w:r>
+              <w:rPr>
+                <w:noProof/>
+              </w:rPr>
+              <w:fldChar w:fldCharType="separate"/>
+            </w:r>
+            <w:r>
+              <w:rPr>
+                <w:noProof/>
+              </w:rPr>
+              <w:t>«DetailedConnectionInfoLink»</w:t>
+            </w:r>
+            <w:r>
+              <w:rPr>
+                <w:noProof/>
+              </w:rPr>
+              <w:fldChar w:fldCharType="end"/>
+            </w:r>
             <w:r>
               <w:t xml:space="preserve">. </w:t>
             </w:r>
@@ -997,11 +1149,11 @@
         </w:tc>
         <w:tc>
           <w:tcPr>
-            <w:tcW w:w="265" w:type="dxa"/>
+            <w:tcW w:w="260" w:type="dxa"/>
             <w:tcBorders>
               <w:left w:val="single" w:sz="6" w:space="0" w:color="auto"/>
             </w:tcBorders>
-            <w:shd w:val="clear" w:color="auto" w:fill="4D677F"/>
+            <w:shd w:val="clear" w:color="auto" w:fill="3E67B1"/>
           </w:tcPr>
           <w:p/>
         </w:tc>
@@ -1009,250 +1161,125 @@
       <w:tr>
         <w:tc>
           <w:tcPr>
-            <w:tcW w:w="265" w:type="dxa"/>
-            <w:shd w:val="clear" w:color="auto" w:fill="4D677F"/>
+            <w:tcW w:w="260" w:type="dxa"/>
+            <w:shd w:val="clear" w:color="auto" w:fill="3E67B1"/>
           </w:tcPr>
+          <w:p/>
           <w:p/>
         </w:tc>
         <w:tc>
           <w:tcPr>
-            <w:tcW w:w="8821" w:type="dxa"/>
-            <w:gridSpan w:val="2"/>
-            <w:shd w:val="clear" w:color="auto" w:fill="000000" w:themeFill="text1"/>
+            <w:tcW w:w="4420" w:type="dxa"/>
+            <w:shd w:val="clear" w:color="auto" w:fill="D0CECE" w:themeFill="background2" w:themeFillShade="E6"/>
           </w:tcPr>
-          <w:tbl>
-            <w:tblPr>
-              <w:tblStyle w:val="TableGrid"/>
-              <w:tblW w:w="0" w:type="auto"/>
-              <w:tblBorders>
-                <w:top w:val="none" w:sz="0" w:space="0" w:color="auto"/>
-                <w:left w:val="none" w:sz="0" w:space="0" w:color="auto"/>
-                <w:bottom w:val="none" w:sz="0" w:space="0" w:color="auto"/>
-                <w:right w:val="none" w:sz="0" w:space="0" w:color="auto"/>
-                <w:insideH w:val="none" w:sz="0" w:space="0" w:color="auto"/>
-                <w:insideV w:val="none" w:sz="0" w:space="0" w:color="auto"/>
-              </w:tblBorders>
-              <w:tblLook w:val="04A0" w:firstRow="1" w:lastRow="0" w:firstColumn="1" w:lastColumn="0" w:noHBand="0" w:noVBand="1"/>
-            </w:tblPr>
-            <w:tblGrid>
-              <w:gridCol w:w="8619"/>
-            </w:tblGrid>
-            <w:tr>
-              <w:tc>
-                <w:tcPr>
-                  <w:tcW w:w="8821" w:type="dxa"/>
-                  <w:shd w:val="clear" w:color="auto" w:fill="000000" w:themeFill="text1"/>
-                </w:tcPr>
-                <w:p>
-                  <w:pPr>
-                    <w:rPr>
-                      <w:rFonts w:eastAsia="Times New Roman" w:cs="Times New Roman"/>
-                    </w:rPr>
-                  </w:pPr>
-                </w:p>
-                <w:tbl>
-                  <w:tblPr>
-                    <w:tblStyle w:val="TableGrid"/>
-                    <w:tblW w:w="0" w:type="auto"/>
-                    <w:tblLook w:val="04A0" w:firstRow="1" w:lastRow="0" w:firstColumn="1" w:lastColumn="0" w:noHBand="0" w:noVBand="1"/>
-                  </w:tblPr>
-                  <w:tblGrid>
-                    <w:gridCol w:w="4296"/>
-                    <w:gridCol w:w="4297"/>
-                  </w:tblGrid>
-                  <w:tr>
-                    <w:tc>
-                      <w:tcPr>
-                        <w:tcW w:w="4297" w:type="dxa"/>
-                        <w:tcBorders>
-                          <w:top w:val="single" w:sz="4" w:space="0" w:color="auto"/>
-                          <w:left w:val="single" w:sz="4" w:space="0" w:color="auto"/>
-                          <w:bottom w:val="single" w:sz="4" w:space="0" w:color="auto"/>
-                          <w:right w:val="single" w:sz="4" w:space="0" w:color="auto"/>
-                        </w:tcBorders>
-                      </w:tcPr>
-                      <w:p>
-                        <w:pPr>
-                          <w:jc w:val="center"/>
-                          <w:rPr>
-                            <w:rFonts w:eastAsia="Times New Roman" w:cs="Times New Roman"/>
-                            <w:sz w:val="18"/>
-                            <w:szCs w:val="18"/>
-                          </w:rPr>
-                        </w:pPr>
-                        <w:r>
-                          <w:rPr>
-                            <w:rFonts w:eastAsia="Times New Roman" w:cs="Times New Roman"/>
-                            <w:sz w:val="18"/>
-                            <w:szCs w:val="18"/>
-                          </w:rPr>
-                          <w:fldChar w:fldCharType="begin"/>
-                        </w:r>
-                        <w:r>
-                          <w:rPr>
-                            <w:rFonts w:eastAsia="Times New Roman" w:cs="Times New Roman"/>
-                            <w:sz w:val="18"/>
-                            <w:szCs w:val="18"/>
-                          </w:rPr>
-                          <w:instrText xml:space="preserve"> MERGEFIELD  AffFooter  \* MERGEFORMAT </w:instrText>
-                        </w:r>
-                        <w:r>
-                          <w:rPr>
-                            <w:rFonts w:eastAsia="Times New Roman" w:cs="Times New Roman"/>
-                            <w:sz w:val="18"/>
-                            <w:szCs w:val="18"/>
-                          </w:rPr>
-                          <w:fldChar w:fldCharType="separate"/>
-                        </w:r>
-                        <w:r>
-                          <w:rPr>
-                            <w:rFonts w:eastAsia="Times New Roman" w:cs="Times New Roman"/>
-                            <w:noProof/>
-                            <w:sz w:val="18"/>
-                            <w:szCs w:val="18"/>
-                          </w:rPr>
-                          <w:t>«AffFooter»</w:t>
-                        </w:r>
-                        <w:r>
-                          <w:rPr>
-                            <w:rFonts w:eastAsia="Times New Roman" w:cs="Times New Roman"/>
-                            <w:sz w:val="18"/>
-                            <w:szCs w:val="18"/>
-                          </w:rPr>
-                          <w:fldChar w:fldCharType="end"/>
-                        </w:r>
-                      </w:p>
-                    </w:tc>
-                    <w:tc>
-                      <w:tcPr>
-                        <w:tcW w:w="4298" w:type="dxa"/>
-                        <w:tcBorders>
-                          <w:top w:val="single" w:sz="4" w:space="0" w:color="auto"/>
-                          <w:left w:val="single" w:sz="4" w:space="0" w:color="auto"/>
-                          <w:bottom w:val="single" w:sz="4" w:space="0" w:color="auto"/>
-                          <w:right w:val="single" w:sz="4" w:space="0" w:color="auto"/>
-                        </w:tcBorders>
-                      </w:tcPr>
-                      <w:p>
-                        <w:pPr>
-                          <w:jc w:val="center"/>
-                          <w:rPr>
-                            <w:sz w:val="18"/>
-                            <w:szCs w:val="18"/>
-                          </w:rPr>
-                        </w:pPr>
-                        <w:r>
-                          <w:rPr>
-                            <w:sz w:val="18"/>
-                            <w:szCs w:val="18"/>
-                          </w:rPr>
-                          <w:t>info@ttstrain.com</w:t>
-                        </w:r>
-                      </w:p>
-                      <w:p>
-                        <w:pPr>
-                          <w:jc w:val="center"/>
-                          <w:rPr>
-                            <w:rFonts w:eastAsia="Times New Roman" w:cs="Times New Roman"/>
-                            <w:sz w:val="18"/>
-                            <w:szCs w:val="18"/>
-                          </w:rPr>
-                        </w:pPr>
-                        <w:bookmarkStart w:id="7" w:name="_GoBack"/>
-                        <w:bookmarkEnd w:id="7"/>
-                        <w:r>
-                          <w:rPr>
-                            <w:rFonts w:eastAsia="Times New Roman" w:cs="Times New Roman"/>
-                            <w:sz w:val="18"/>
-                            <w:szCs w:val="18"/>
-                          </w:rPr>
-                          <w:t xml:space="preserve">800-831-0678 </w:t>
-                        </w:r>
-                      </w:p>
-                    </w:tc>
-                  </w:tr>
-                  <w:tr>
-                    <w:tc>
-                      <w:tcPr>
-                        <w:tcW w:w="8595" w:type="dxa"/>
-                        <w:gridSpan w:val="2"/>
-                        <w:tcBorders>
-                          <w:top w:val="single" w:sz="4" w:space="0" w:color="auto"/>
-                          <w:left w:val="single" w:sz="4" w:space="0" w:color="auto"/>
-                          <w:bottom w:val="single" w:sz="4" w:space="0" w:color="auto"/>
-                          <w:right w:val="single" w:sz="4" w:space="0" w:color="auto"/>
-                        </w:tcBorders>
-                      </w:tcPr>
-                      <w:p>
-                        <w:pPr>
-                          <w:jc w:val="center"/>
-                          <w:rPr>
-                            <w:rFonts w:eastAsia="Times New Roman" w:cs="Times New Roman"/>
-                            <w:sz w:val="18"/>
-                            <w:szCs w:val="18"/>
-                          </w:rPr>
-                        </w:pPr>
-                        <w:r>
-                          <w:rPr>
-                            <w:rFonts w:eastAsia="Times New Roman" w:cs="Times New Roman"/>
-                            <w:sz w:val="18"/>
-                            <w:szCs w:val="18"/>
-                          </w:rPr>
-                          <w:fldChar w:fldCharType="begin"/>
-                        </w:r>
-                        <w:r>
-                          <w:rPr>
-                            <w:rFonts w:eastAsia="Times New Roman" w:cs="Times New Roman"/>
-                            <w:sz w:val="18"/>
-                            <w:szCs w:val="18"/>
-                          </w:rPr>
-                          <w:instrText xml:space="preserve"> MERGEFIELD  ServiceNote  \* MERGEFORMAT </w:instrText>
-                        </w:r>
-                        <w:r>
-                          <w:rPr>
-                            <w:rFonts w:eastAsia="Times New Roman" w:cs="Times New Roman"/>
-                            <w:sz w:val="18"/>
-                            <w:szCs w:val="18"/>
-                          </w:rPr>
-                          <w:fldChar w:fldCharType="separate"/>
-                        </w:r>
-                        <w:r>
-                          <w:rPr>
-                            <w:rFonts w:eastAsia="Times New Roman" w:cs="Times New Roman"/>
-                            <w:noProof/>
-                            <w:sz w:val="18"/>
-                            <w:szCs w:val="18"/>
-                          </w:rPr>
-                          <w:t>«ServiceNote»</w:t>
-                        </w:r>
-                        <w:r>
-                          <w:rPr>
-                            <w:rFonts w:eastAsia="Times New Roman" w:cs="Times New Roman"/>
-                            <w:sz w:val="18"/>
-                            <w:szCs w:val="18"/>
-                          </w:rPr>
-                          <w:fldChar w:fldCharType="end"/>
-                        </w:r>
-                      </w:p>
-                    </w:tc>
-                  </w:tr>
-                </w:tbl>
-                <w:p>
-                  <w:pPr>
-                    <w:rPr>
-                      <w:rFonts w:eastAsia="Times New Roman" w:cs="Times New Roman"/>
-                    </w:rPr>
-                  </w:pPr>
-                </w:p>
-              </w:tc>
-            </w:tr>
-          </w:tbl>
-          <w:p/>
+          <w:p>
+            <w:pPr>
+              <w:jc w:val="center"/>
+              <w:rPr>
+                <w:sz w:val="18"/>
+                <w:szCs w:val="18"/>
+              </w:rPr>
+            </w:pPr>
+          </w:p>
+          <w:p>
+            <w:pPr>
+              <w:jc w:val="center"/>
+            </w:pPr>
+            <w:r>
+              <w:rPr>
+                <w:sz w:val="18"/>
+                <w:szCs w:val="18"/>
+              </w:rPr>
+              <w:fldChar w:fldCharType="begin"/>
+            </w:r>
+            <w:r>
+              <w:rPr>
+                <w:sz w:val="18"/>
+                <w:szCs w:val="18"/>
+              </w:rPr>
+              <w:instrText xml:space="preserve"> MERGEFIELD  AffFooter  \* MERGEFORMAT </w:instrText>
+            </w:r>
+            <w:r>
+              <w:rPr>
+                <w:sz w:val="18"/>
+                <w:szCs w:val="18"/>
+              </w:rPr>
+              <w:fldChar w:fldCharType="separate"/>
+            </w:r>
+            <w:r>
+              <w:rPr>
+                <w:noProof/>
+                <w:sz w:val="18"/>
+                <w:szCs w:val="18"/>
+              </w:rPr>
+              <w:t>«AffFooter»</w:t>
+            </w:r>
+            <w:r>
+              <w:rPr>
+                <w:sz w:val="18"/>
+                <w:szCs w:val="18"/>
+              </w:rPr>
+              <w:fldChar w:fldCharType="end"/>
+            </w:r>
+          </w:p>
         </w:tc>
         <w:tc>
           <w:tcPr>
-            <w:tcW w:w="265" w:type="dxa"/>
-            <w:shd w:val="clear" w:color="auto" w:fill="4D677F"/>
+            <w:tcW w:w="4420" w:type="dxa"/>
+            <w:gridSpan w:val="2"/>
+            <w:shd w:val="clear" w:color="auto" w:fill="D0CECE" w:themeFill="background2" w:themeFillShade="E6"/>
+          </w:tcPr>
+          <w:p>
+            <w:pPr>
+              <w:jc w:val="center"/>
+              <w:rPr>
+                <w:sz w:val="18"/>
+                <w:szCs w:val="18"/>
+              </w:rPr>
+            </w:pPr>
+          </w:p>
+          <w:p>
+            <w:pPr>
+              <w:jc w:val="center"/>
+              <w:rPr>
+                <w:sz w:val="18"/>
+                <w:szCs w:val="18"/>
+              </w:rPr>
+            </w:pPr>
+            <w:r>
+              <w:rPr>
+                <w:sz w:val="18"/>
+                <w:szCs w:val="18"/>
+              </w:rPr>
+              <w:t>info@ttstrain.com</w:t>
+            </w:r>
+          </w:p>
+          <w:p>
+            <w:pPr>
+              <w:jc w:val="center"/>
+              <w:rPr>
+                <w:sz w:val="18"/>
+                <w:szCs w:val="18"/>
+              </w:rPr>
+            </w:pPr>
+            <w:r>
+              <w:rPr>
+                <w:sz w:val="18"/>
+                <w:szCs w:val="18"/>
+              </w:rPr>
+              <w:t>800-831-0678</w:t>
+            </w:r>
+          </w:p>
+          <w:p>
+            <w:pPr>
+              <w:jc w:val="center"/>
+            </w:pPr>
+          </w:p>
+        </w:tc>
+        <w:tc>
+          <w:tcPr>
+            <w:tcW w:w="260" w:type="dxa"/>
+            <w:shd w:val="clear" w:color="auto" w:fill="3E67B1"/>
           </w:tcPr>
           <w:p/>
         </w:tc>
@@ -1260,9 +1287,77 @@
       <w:tr>
         <w:tc>
           <w:tcPr>
-            <w:tcW w:w="9351" w:type="dxa"/>
-            <w:gridSpan w:val="4"/>
-            <w:shd w:val="clear" w:color="auto" w:fill="4D677F"/>
+            <w:tcW w:w="260" w:type="dxa"/>
+            <w:shd w:val="clear" w:color="auto" w:fill="3E67B1"/>
+          </w:tcPr>
+          <w:p/>
+        </w:tc>
+        <w:tc>
+          <w:tcPr>
+            <w:tcW w:w="8840" w:type="dxa"/>
+            <w:gridSpan w:val="3"/>
+            <w:shd w:val="clear" w:color="auto" w:fill="D0CECE" w:themeFill="background2" w:themeFillShade="E6"/>
+          </w:tcPr>
+          <w:p>
+            <w:pPr>
+              <w:jc w:val="center"/>
+              <w:rPr>
+                <w:sz w:val="18"/>
+                <w:szCs w:val="18"/>
+              </w:rPr>
+            </w:pPr>
+            <w:r>
+              <w:rPr>
+                <w:sz w:val="18"/>
+                <w:szCs w:val="18"/>
+              </w:rPr>
+              <w:fldChar w:fldCharType="begin"/>
+            </w:r>
+            <w:r>
+              <w:rPr>
+                <w:sz w:val="18"/>
+                <w:szCs w:val="18"/>
+              </w:rPr>
+              <w:instrText xml:space="preserve"> MERGEFIELD  ServiceNote  \* MERGEFORMAT </w:instrText>
+            </w:r>
+            <w:r>
+              <w:rPr>
+                <w:sz w:val="18"/>
+                <w:szCs w:val="18"/>
+              </w:rPr>
+              <w:fldChar w:fldCharType="separate"/>
+            </w:r>
+            <w:r>
+              <w:rPr>
+                <w:noProof/>
+                <w:sz w:val="18"/>
+                <w:szCs w:val="18"/>
+              </w:rPr>
+              <w:t>«ServiceNote»</w:t>
+            </w:r>
+            <w:r>
+              <w:rPr>
+                <w:sz w:val="18"/>
+                <w:szCs w:val="18"/>
+              </w:rPr>
+              <w:fldChar w:fldCharType="end"/>
+            </w:r>
+          </w:p>
+        </w:tc>
+        <w:tc>
+          <w:tcPr>
+            <w:tcW w:w="260" w:type="dxa"/>
+            <w:shd w:val="clear" w:color="auto" w:fill="3E67B1"/>
+          </w:tcPr>
+          <w:p/>
+        </w:tc>
+      </w:tr>
+      <w:tr>
+        <w:tc>
+          <w:tcPr>
+            <w:tcW w:w="9360" w:type="dxa"/>
+            <w:gridSpan w:val="5"/>
+            <w:shd w:val="clear" w:color="auto" w:fill="3E67B1"/>
           </w:tcPr>
           <w:p/>
         </w:tc>
@@ -1726,7 +1821,6 @@
     <w:name w:val="Hyperlink"/>
     <w:basedOn w:val="DefaultParagraphFont"/>
     <w:uiPriority w:val="99"/>
-    <w:semiHidden/>
     <w:unhideWhenUsed/>
     <w:rsid w:val="00226AB3"/>
     <w:rPr>
@@ -1776,6 +1870,18 @@
     <w:pPr>
       <w:spacing w:after="0" w:line="240" w:lineRule="auto"/>
     </w:pPr>
+  </w:style>
+  <w:style w:type="character" w:styleId="UnresolvedMention">
+    <w:name w:val="Unresolved Mention"/>
+    <w:basedOn w:val="DefaultParagraphFont"/>
+    <w:uiPriority w:val="99"/>
+    <w:semiHidden/>
+    <w:unhideWhenUsed/>
+    <w:rsid w:val="00D709F8"/>
+    <w:rPr>
+      <w:color w:val="605E5C"/>
+      <w:shd w:val="clear" w:color="auto" w:fill="E1DFDD"/>
+    </w:rPr>
   </w:style>
 </w:styles>
 </file>
@@ -2046,7 +2152,7 @@
 </file>
 
 <file path=customXml/itemProps1.xml><?xml version="1.0" encoding="utf-8"?>
-<ds:datastoreItem xmlns:ds="http://schemas.openxmlformats.org/officeDocument/2006/customXml" ds:itemID="{048B72E2-D51F-451F-8586-E8243B16BB58}">
+<ds:datastoreItem xmlns:ds="http://schemas.openxmlformats.org/officeDocument/2006/customXml" ds:itemID="{7C21E7E7-D1BE-410C-9CCC-1BF6C6A90F29}">
   <ds:schemaRefs>
     <ds:schemaRef ds:uri="http://schemas.openxmlformats.org/officeDocument/2006/bibliography"/>
   </ds:schemaRefs>

</xml_diff>